<commit_message>
chore: update HTTP Proxy documentation
</commit_message>
<xml_diff>
--- a/Отчет_HTTP_Proxy.docx
+++ b/Отчет_HTTP_Proxy.docx
@@ -136,7 +136,7 @@
           <w:szCs w:val="28"/>
           <w:rtl w:val="0"/>
         </w:rPr>
-        <w:t xml:space="preserve">по практическому занятию №2</w:t>
+        <w:t xml:space="preserve">по контрольной работе №3</w:t>
       </w:r>
     </w:p>
     <w:p>
@@ -834,6 +834,7 @@
     <w:p>
       <w:pPr>
         <w:spacing w:after="127" w:line="360" w:lineRule="auto"/>
+        <w:ind w:left="0" w:firstLine="0"/>
         <w:rPr>
           <w:sz w:val="36"/>
           <w:szCs w:val="36"/>
@@ -859,6 +860,7 @@
     <w:p>
       <w:pPr>
         <w:spacing w:after="74" w:line="360" w:lineRule="auto"/>
+        <w:ind w:firstLine="720"/>
         <w:rPr>
           <w:sz w:val="32"/>
           <w:szCs w:val="32"/>
@@ -884,6 +886,7 @@
     <w:p>
       <w:pPr>
         <w:spacing w:after="93" w:line="360" w:lineRule="auto"/>
+        <w:ind w:firstLine="720"/>
         <w:jc w:val="both"/>
         <w:rPr>
           <w:sz w:val="28"/>
@@ -1835,6 +1838,7 @@
     <w:p>
       <w:pPr>
         <w:spacing w:after="74" w:line="360" w:lineRule="auto"/>
+        <w:ind w:firstLine="720"/>
         <w:rPr>
           <w:sz w:val="32"/>
           <w:szCs w:val="32"/>
@@ -1860,6 +1864,7 @@
     <w:p>
       <w:pPr>
         <w:spacing w:after="93" w:line="360" w:lineRule="auto"/>
+        <w:ind w:firstLine="720"/>
         <w:jc w:val="both"/>
         <w:rPr>
           <w:sz w:val="28"/>
@@ -1904,6 +1909,7 @@
     <w:p>
       <w:pPr>
         <w:spacing w:after="74" w:line="360" w:lineRule="auto"/>
+        <w:ind w:firstLine="720"/>
         <w:rPr>
           <w:sz w:val="32"/>
           <w:szCs w:val="32"/>
@@ -2099,6 +2105,7 @@
     <w:p>
       <w:pPr>
         <w:spacing w:after="74" w:line="360" w:lineRule="auto"/>
+        <w:ind w:firstLine="720"/>
         <w:rPr>
           <w:sz w:val="24"/>
           <w:szCs w:val="24"/>
@@ -3190,6 +3197,7 @@
           <w:szCs w:val="32"/>
           <w:rtl w:val="0"/>
         </w:rPr>
+        <w:tab/>
         <w:t xml:space="preserve">4.1. Методология</w:t>
       </w:r>
     </w:p>
@@ -3218,15 +3226,14 @@
           <w:szCs w:val="28"/>
           <w:rtl w:val="0"/>
         </w:rPr>
+        <w:tab/>
         <w:t xml:space="preserve">Требования</w:t>
         <w:tab/>
         <w:t xml:space="preserve">сформированы</w:t>
         <w:tab/>
         <w:t xml:space="preserve">на</w:t>
         <w:tab/>
-        <w:t xml:space="preserve">основе</w:t>
-        <w:tab/>
-        <w:t xml:space="preserve">методического</w:t>
+        <w:t xml:space="preserve">основеметодического</w:t>
         <w:tab/>
         <w:t xml:space="preserve">задания</w:t>
         <w:tab/>
@@ -3258,6 +3265,7 @@
           <w:szCs w:val="32"/>
           <w:rtl w:val="0"/>
         </w:rPr>
+        <w:tab/>
         <w:t xml:space="preserve">4.2 Бизнес-требования</w:t>
       </w:r>
     </w:p>
@@ -3546,6 +3554,7 @@
           <w:szCs w:val="32"/>
           <w:rtl w:val="0"/>
         </w:rPr>
+        <w:tab/>
         <w:t xml:space="preserve">4.3. Пользовательские требования</w:t>
       </w:r>
     </w:p>
@@ -3886,6 +3895,7 @@
           <w:szCs w:val="32"/>
           <w:rtl w:val="0"/>
         </w:rPr>
+        <w:tab/>
         <w:t xml:space="preserve">4.4 Функциональные требования</w:t>
       </w:r>
     </w:p>
@@ -4508,6 +4518,7 @@
     <w:p>
       <w:pPr>
         <w:spacing w:after="74" w:line="360" w:lineRule="auto"/>
+        <w:ind w:firstLine="720"/>
         <w:rPr>
           <w:b w:val="1"/>
           <w:bCs w:val="1"/>
@@ -5670,7 +5681,6 @@
           <w:rFonts w:ascii="Times New Roman" w:cs="Times New Roman" w:eastAsia="Times New Roman" w:hAnsi="Times New Roman"/>
           <w:sz w:val="28"/>
           <w:szCs w:val="28"/>
-          <w:u w:val="none"/>
         </w:rPr>
       </w:pPr>
       <w:r>
@@ -5692,6 +5702,11 @@
           <w:rtl w:val="0"/>
         </w:rPr>
         <w:t xml:space="preserve"> — акторы «Клиент» и «Администратор», прецеденты: отправка запроса через прокси, проверка URL, работа с кешем, проксирование к origin, настройка правил.</w:t>
+      </w:r>
+      <w:r>
+        <w:rPr>
+          <w:rtl w:val="0"/>
+        </w:rPr>
       </w:r>
     </w:p>
     <w:p>
@@ -5712,12 +5727,12 @@
           <wp:inline distB="114300" distT="114300" distL="114300" distR="114300">
             <wp:extent cx="5943600" cy="4343400"/>
             <wp:effectExtent b="0" l="0" r="0" t="0"/>
-            <wp:docPr id="4" name="image1.png"/>
+            <wp:docPr id="1" name="image4.png"/>
             <a:graphic>
               <a:graphicData uri="http://schemas.openxmlformats.org/drawingml/2006/picture">
                 <pic:pic>
                   <pic:nvPicPr>
-                    <pic:cNvPr id="0" name="image1.png"/>
+                    <pic:cNvPr id="0" name="image4.png"/>
                     <pic:cNvPicPr preferRelativeResize="0"/>
                   </pic:nvPicPr>
                   <pic:blipFill>
@@ -5758,7 +5773,6 @@
         <w:rPr>
           <w:sz w:val="28"/>
           <w:szCs w:val="28"/>
-          <w:u w:val="none"/>
         </w:rPr>
       </w:pPr>
       <w:r>
@@ -5906,6 +5920,11 @@
           <w:rtl w:val="0"/>
         </w:rPr>
         <w:t xml:space="preserve"> и связи между ними.</w:t>
+      </w:r>
+      <w:r>
+        <w:rPr>
+          <w:rtl w:val="0"/>
+        </w:rPr>
       </w:r>
     </w:p>
     <w:p>
@@ -5926,12 +5945,12 @@
           <wp:inline distB="114300" distT="114300" distL="114300" distR="114300">
             <wp:extent cx="5943600" cy="5003800"/>
             <wp:effectExtent b="0" l="0" r="0" t="0"/>
-            <wp:docPr id="1" name="image2.png"/>
+            <wp:docPr id="3" name="image1.png"/>
             <a:graphic>
               <a:graphicData uri="http://schemas.openxmlformats.org/drawingml/2006/picture">
                 <pic:pic>
                   <pic:nvPicPr>
-                    <pic:cNvPr id="0" name="image2.png"/>
+                    <pic:cNvPr id="0" name="image1.png"/>
                     <pic:cNvPicPr preferRelativeResize="0"/>
                   </pic:nvPicPr>
                   <pic:blipFill>
@@ -5973,7 +5992,6 @@
           <w:rFonts w:ascii="Times New Roman" w:cs="Times New Roman" w:eastAsia="Times New Roman" w:hAnsi="Times New Roman"/>
           <w:sz w:val="28"/>
           <w:szCs w:val="28"/>
-          <w:u w:val="none"/>
         </w:rPr>
       </w:pPr>
       <w:r>
@@ -5995,6 +6013,11 @@
           <w:rtl w:val="0"/>
         </w:rPr>
         <w:t xml:space="preserve"> — основной сценарий GET-запроса с промахом кеша, обращением к фильтру, origin-серверу и записью в кеш; примечание о повторном запросе из кеша.</w:t>
+      </w:r>
+      <w:r>
+        <w:rPr>
+          <w:rtl w:val="0"/>
+        </w:rPr>
       </w:r>
     </w:p>
     <w:p>
@@ -6015,12 +6038,12 @@
           <wp:inline distB="114300" distT="114300" distL="114300" distR="114300">
             <wp:extent cx="5943600" cy="3683000"/>
             <wp:effectExtent b="0" l="0" r="0" t="0"/>
-            <wp:docPr id="2" name="image3.png"/>
+            <wp:docPr id="2" name="image2.png"/>
             <a:graphic>
               <a:graphicData uri="http://schemas.openxmlformats.org/drawingml/2006/picture">
                 <pic:pic>
                   <pic:nvPicPr>
-                    <pic:cNvPr id="0" name="image3.png"/>
+                    <pic:cNvPr id="0" name="image2.png"/>
                     <pic:cNvPicPr preferRelativeResize="0"/>
                   </pic:nvPicPr>
                   <pic:blipFill>
@@ -6061,7 +6084,6 @@
         <w:rPr>
           <w:sz w:val="28"/>
           <w:szCs w:val="28"/>
-          <w:u w:val="none"/>
         </w:rPr>
       </w:pPr>
       <w:r>
@@ -6119,6 +6141,11 @@
           <w:rtl w:val="0"/>
         </w:rPr>
         <w:t xml:space="preserve">.</w:t>
+      </w:r>
+      <w:r>
+        <w:rPr>
+          <w:rtl w:val="0"/>
+        </w:rPr>
       </w:r>
     </w:p>
     <w:p>
@@ -6139,12 +6166,12 @@
           <wp:inline distB="114300" distT="114300" distL="114300" distR="114300">
             <wp:extent cx="5943600" cy="5511800"/>
             <wp:effectExtent b="0" l="0" r="0" t="0"/>
-            <wp:docPr id="3" name="image4.png"/>
+            <wp:docPr id="4" name="image3.png"/>
             <a:graphic>
               <a:graphicData uri="http://schemas.openxmlformats.org/drawingml/2006/picture">
                 <pic:pic>
                   <pic:nvPicPr>
-                    <pic:cNvPr id="0" name="image4.png"/>
+                    <pic:cNvPr id="0" name="image3.png"/>
                     <pic:cNvPicPr preferRelativeResize="0"/>
                   </pic:nvPicPr>
                   <pic:blipFill>
@@ -6261,6 +6288,1106 @@
         <w:rPr>
           <w:rtl w:val="0"/>
         </w:rPr>
+      </w:r>
+    </w:p>
+    <w:p>
+      <w:pPr>
+        <w:rPr>
+          <w:sz w:val="28"/>
+          <w:szCs w:val="28"/>
+        </w:rPr>
+      </w:pPr>
+      <w:r>
+        <w:rPr>
+          <w:rtl w:val="0"/>
+        </w:rPr>
+      </w:r>
+    </w:p>
+    <w:p>
+      <w:pPr>
+        <w:ind w:left="0" w:firstLine="0"/>
+        <w:rPr>
+          <w:b w:val="1"/>
+          <w:bCs w:val="1"/>
+          <w:sz w:val="36"/>
+          <w:szCs w:val="36"/>
+        </w:rPr>
+      </w:pPr>
+      <w:r>
+        <w:rPr>
+          <w:b w:val="1"/>
+          <w:bCs w:val="1"/>
+          <w:sz w:val="36"/>
+          <w:szCs w:val="36"/>
+          <w:rtl w:val="0"/>
+        </w:rPr>
+        <w:t xml:space="preserve">8. Паттерны проектирования</w:t>
+      </w:r>
+    </w:p>
+    <w:p>
+      <w:pPr>
+        <w:ind w:firstLine="720"/>
+        <w:jc w:val="both"/>
+        <w:rPr>
+          <w:b w:val="1"/>
+          <w:bCs w:val="1"/>
+          <w:sz w:val="28"/>
+          <w:szCs w:val="28"/>
+        </w:rPr>
+      </w:pPr>
+      <w:r>
+        <w:rPr>
+          <w:b w:val="1"/>
+          <w:bCs w:val="1"/>
+          <w:sz w:val="28"/>
+          <w:szCs w:val="28"/>
+          <w:rtl w:val="0"/>
+        </w:rPr>
+        <w:t xml:space="preserve">8.1. Соответствие изучаемому курсу и уместность для проекта. </w:t>
+      </w:r>
+    </w:p>
+    <w:p>
+      <w:pPr>
+        <w:ind w:firstLine="720"/>
+        <w:jc w:val="both"/>
+        <w:rPr>
+          <w:sz w:val="28"/>
+          <w:szCs w:val="28"/>
+        </w:rPr>
+      </w:pPr>
+      <w:r>
+        <w:rPr>
+          <w:sz w:val="28"/>
+          <w:szCs w:val="28"/>
+          <w:rtl w:val="0"/>
+        </w:rPr>
+        <w:t xml:space="preserve">Ниже отобраны порождающие, структурные и поведенческие паттерны, согласуемые с курсом и с архитектурой HTTP-прокси, описанной в разделе 6 (сущности HttpProxyServer, обработчик сессии, UrlFilter, ResponseCache, CacheEntry, UpstreamConnector, ProxyConfig и др.).</w:t>
+      </w:r>
+    </w:p>
+    <w:tbl>
+      <w:tblPr>
+        <w:tblStyle w:val="Table12"/>
+        <w:tblW w:w="9360.0" w:type="dxa"/>
+        <w:jc w:val="left"/>
+        <w:tblBorders>
+          <w:top w:color="000000" w:space="0" w:sz="8" w:val="single"/>
+          <w:left w:color="000000" w:space="0" w:sz="8" w:val="single"/>
+          <w:bottom w:color="000000" w:space="0" w:sz="8" w:val="single"/>
+          <w:right w:color="000000" w:space="0" w:sz="8" w:val="single"/>
+          <w:insideH w:color="000000" w:space="0" w:sz="8" w:val="single"/>
+          <w:insideV w:color="000000" w:space="0" w:sz="8" w:val="single"/>
+        </w:tblBorders>
+        <w:tblLayout w:type="fixed"/>
+        <w:tblLook w:val="0400"/>
+      </w:tblPr>
+      <w:tblGrid>
+        <w:gridCol w:w="3120"/>
+        <w:gridCol w:w="3120"/>
+        <w:gridCol w:w="3120"/>
+        <w:tblGridChange w:id="0">
+          <w:tblGrid>
+            <w:gridCol w:w="3120"/>
+            <w:gridCol w:w="3120"/>
+            <w:gridCol w:w="3120"/>
+          </w:tblGrid>
+        </w:tblGridChange>
+      </w:tblGrid>
+      <w:tr>
+        <w:trPr>
+          <w:cantSplit w:val="0"/>
+          <w:tblHeader w:val="0"/>
+        </w:trPr>
+        <w:tc>
+          <w:tcPr>
+            <w:shd w:fill="e7e6e6" w:val="clear"/>
+          </w:tcPr>
+          <w:p>
+            <w:pPr>
+              <w:rPr>
+                <w:sz w:val="28"/>
+                <w:szCs w:val="28"/>
+              </w:rPr>
+            </w:pPr>
+            <w:r>
+              <w:rPr>
+                <w:sz w:val="28"/>
+                <w:szCs w:val="28"/>
+                <w:rtl w:val="0"/>
+              </w:rPr>
+              <w:t xml:space="preserve">Паттерн (GoF)</w:t>
+            </w:r>
+          </w:p>
+        </w:tc>
+        <w:tc>
+          <w:tcPr>
+            <w:shd w:fill="e7e6e6" w:val="clear"/>
+          </w:tcPr>
+          <w:p>
+            <w:pPr>
+              <w:rPr>
+                <w:sz w:val="28"/>
+                <w:szCs w:val="28"/>
+              </w:rPr>
+            </w:pPr>
+            <w:r>
+              <w:rPr>
+                <w:sz w:val="28"/>
+                <w:szCs w:val="28"/>
+                <w:rtl w:val="0"/>
+              </w:rPr>
+              <w:t xml:space="preserve">Категория</w:t>
+            </w:r>
+          </w:p>
+        </w:tc>
+        <w:tc>
+          <w:tcPr>
+            <w:shd w:fill="e7e6e6" w:val="clear"/>
+          </w:tcPr>
+          <w:p>
+            <w:pPr>
+              <w:rPr>
+                <w:sz w:val="28"/>
+                <w:szCs w:val="28"/>
+              </w:rPr>
+            </w:pPr>
+            <w:r>
+              <w:rPr>
+                <w:sz w:val="28"/>
+                <w:szCs w:val="28"/>
+                <w:rtl w:val="0"/>
+              </w:rPr>
+              <w:t xml:space="preserve">Почему уместен в нашем проекте</w:t>
+            </w:r>
+          </w:p>
+        </w:tc>
+      </w:tr>
+      <w:tr>
+        <w:trPr>
+          <w:cantSplit w:val="0"/>
+          <w:tblHeader w:val="0"/>
+        </w:trPr>
+        <w:tc>
+          <w:tcPr/>
+          <w:p>
+            <w:pPr>
+              <w:rPr>
+                <w:sz w:val="28"/>
+                <w:szCs w:val="28"/>
+              </w:rPr>
+            </w:pPr>
+            <w:r>
+              <w:rPr>
+                <w:sz w:val="28"/>
+                <w:szCs w:val="28"/>
+                <w:rtl w:val="0"/>
+              </w:rPr>
+              <w:t xml:space="preserve">Proxy (заместитель)</w:t>
+            </w:r>
+          </w:p>
+        </w:tc>
+        <w:tc>
+          <w:tcPr/>
+          <w:p>
+            <w:pPr>
+              <w:rPr>
+                <w:sz w:val="28"/>
+                <w:szCs w:val="28"/>
+              </w:rPr>
+            </w:pPr>
+            <w:r>
+              <w:rPr>
+                <w:sz w:val="28"/>
+                <w:szCs w:val="28"/>
+                <w:rtl w:val="0"/>
+              </w:rPr>
+              <w:t xml:space="preserve">структурный</w:t>
+            </w:r>
+          </w:p>
+        </w:tc>
+        <w:tc>
+          <w:tcPr/>
+          <w:p>
+            <w:pPr>
+              <w:rPr>
+                <w:sz w:val="28"/>
+                <w:szCs w:val="28"/>
+              </w:rPr>
+            </w:pPr>
+            <w:r>
+              <w:rPr>
+                <w:sz w:val="28"/>
+                <w:szCs w:val="28"/>
+                <w:rtl w:val="0"/>
+              </w:rPr>
+              <w:t xml:space="preserve">Смысл проекта: клиенты обращаются к веб-ресурсу не напрямую, а через сервер-заместитель, который перехватывает запросы, может отдать ответ из кеша либо инициирует обращение к origin.</w:t>
+            </w:r>
+          </w:p>
+        </w:tc>
+      </w:tr>
+      <w:tr>
+        <w:trPr>
+          <w:cantSplit w:val="0"/>
+          <w:tblHeader w:val="0"/>
+        </w:trPr>
+        <w:tc>
+          <w:tcPr/>
+          <w:p>
+            <w:pPr>
+              <w:rPr>
+                <w:sz w:val="28"/>
+                <w:szCs w:val="28"/>
+              </w:rPr>
+            </w:pPr>
+            <w:r>
+              <w:rPr>
+                <w:sz w:val="28"/>
+                <w:szCs w:val="28"/>
+                <w:rtl w:val="0"/>
+              </w:rPr>
+              <w:t xml:space="preserve">Фасад</w:t>
+            </w:r>
+          </w:p>
+        </w:tc>
+        <w:tc>
+          <w:tcPr/>
+          <w:p>
+            <w:pPr>
+              <w:rPr>
+                <w:sz w:val="28"/>
+                <w:szCs w:val="28"/>
+              </w:rPr>
+            </w:pPr>
+            <w:r>
+              <w:rPr>
+                <w:sz w:val="28"/>
+                <w:szCs w:val="28"/>
+                <w:rtl w:val="0"/>
+              </w:rPr>
+              <w:t xml:space="preserve">структурный</w:t>
+            </w:r>
+          </w:p>
+        </w:tc>
+        <w:tc>
+          <w:tcPr/>
+          <w:p>
+            <w:pPr>
+              <w:rPr>
+                <w:sz w:val="28"/>
+                <w:szCs w:val="28"/>
+              </w:rPr>
+            </w:pPr>
+            <w:r>
+              <w:rPr>
+                <w:sz w:val="28"/>
+                <w:szCs w:val="28"/>
+                <w:rtl w:val="0"/>
+              </w:rPr>
+              <w:t xml:space="preserve">HttpProxyServer даёт внешнему коду единую точку входа: внутри согласуются фильтр, кеш, журнал, подключение к upstream (NFR-2, NFR-4).</w:t>
+            </w:r>
+          </w:p>
+        </w:tc>
+      </w:tr>
+      <w:tr>
+        <w:trPr>
+          <w:cantSplit w:val="0"/>
+          <w:tblHeader w:val="0"/>
+        </w:trPr>
+        <w:tc>
+          <w:tcPr/>
+          <w:p>
+            <w:pPr>
+              <w:rPr>
+                <w:sz w:val="28"/>
+                <w:szCs w:val="28"/>
+              </w:rPr>
+            </w:pPr>
+            <w:r>
+              <w:rPr>
+                <w:sz w:val="28"/>
+                <w:szCs w:val="28"/>
+                <w:rtl w:val="0"/>
+              </w:rPr>
+              <w:t xml:space="preserve">Factory Method / фабрика</w:t>
+            </w:r>
+          </w:p>
+        </w:tc>
+        <w:tc>
+          <w:tcPr/>
+          <w:p>
+            <w:pPr>
+              <w:rPr>
+                <w:sz w:val="28"/>
+                <w:szCs w:val="28"/>
+              </w:rPr>
+            </w:pPr>
+            <w:r>
+              <w:rPr>
+                <w:sz w:val="28"/>
+                <w:szCs w:val="28"/>
+                <w:rtl w:val="0"/>
+              </w:rPr>
+              <w:t xml:space="preserve">порождающий</w:t>
+            </w:r>
+          </w:p>
+        </w:tc>
+        <w:tc>
+          <w:tcPr/>
+          <w:p>
+            <w:pPr>
+              <w:rPr>
+                <w:sz w:val="28"/>
+                <w:szCs w:val="28"/>
+              </w:rPr>
+            </w:pPr>
+            <w:r>
+              <w:rPr>
+                <w:sz w:val="28"/>
+                <w:szCs w:val="28"/>
+                <w:rtl w:val="0"/>
+              </w:rPr>
+              <w:t xml:space="preserve">Создание готовой «сессии» для каждого соединения (ClientSessionFactory) изолирует конструирование обработчика от цикла accept (проще тестирование и сопровождение).</w:t>
+            </w:r>
+          </w:p>
+        </w:tc>
+      </w:tr>
+      <w:tr>
+        <w:trPr>
+          <w:cantSplit w:val="0"/>
+          <w:tblHeader w:val="0"/>
+        </w:trPr>
+        <w:tc>
+          <w:tcPr/>
+          <w:p>
+            <w:pPr>
+              <w:rPr>
+                <w:sz w:val="28"/>
+                <w:szCs w:val="28"/>
+              </w:rPr>
+            </w:pPr>
+            <w:r>
+              <w:rPr>
+                <w:sz w:val="28"/>
+                <w:szCs w:val="28"/>
+                <w:rtl w:val="0"/>
+              </w:rPr>
+              <w:t xml:space="preserve">Singleton</w:t>
+            </w:r>
+          </w:p>
+        </w:tc>
+        <w:tc>
+          <w:tcPr/>
+          <w:p>
+            <w:pPr>
+              <w:rPr>
+                <w:sz w:val="28"/>
+                <w:szCs w:val="28"/>
+              </w:rPr>
+            </w:pPr>
+            <w:r>
+              <w:rPr>
+                <w:sz w:val="28"/>
+                <w:szCs w:val="28"/>
+                <w:rtl w:val="0"/>
+              </w:rPr>
+              <w:t xml:space="preserve">порождающий</w:t>
+            </w:r>
+          </w:p>
+        </w:tc>
+        <w:tc>
+          <w:tcPr/>
+          <w:p>
+            <w:pPr>
+              <w:rPr>
+                <w:sz w:val="28"/>
+                <w:szCs w:val="28"/>
+              </w:rPr>
+            </w:pPr>
+            <w:r>
+              <w:rPr>
+                <w:sz w:val="28"/>
+                <w:szCs w:val="28"/>
+                <w:rtl w:val="0"/>
+              </w:rPr>
+              <w:t xml:space="preserve">Осторожно: злоупотреблять нельзя. Согласованный объект конфигурации (ProxyConfig) с параметрами listen_*, путями, политикой кеша снижает риск рассинхронности (см. FR-9, NFR-3).</w:t>
+            </w:r>
+          </w:p>
+        </w:tc>
+      </w:tr>
+      <w:tr>
+        <w:trPr>
+          <w:cantSplit w:val="0"/>
+          <w:tblHeader w:val="0"/>
+        </w:trPr>
+        <w:tc>
+          <w:tcPr/>
+          <w:p>
+            <w:pPr>
+              <w:rPr>
+                <w:sz w:val="28"/>
+                <w:szCs w:val="28"/>
+              </w:rPr>
+            </w:pPr>
+            <w:r>
+              <w:rPr>
+                <w:sz w:val="28"/>
+                <w:szCs w:val="28"/>
+                <w:rtl w:val="0"/>
+              </w:rPr>
+              <w:t xml:space="preserve">Chain of Responsibility</w:t>
+            </w:r>
+          </w:p>
+        </w:tc>
+        <w:tc>
+          <w:tcPr/>
+          <w:p>
+            <w:pPr>
+              <w:rPr>
+                <w:sz w:val="28"/>
+                <w:szCs w:val="28"/>
+              </w:rPr>
+            </w:pPr>
+            <w:r>
+              <w:rPr>
+                <w:sz w:val="28"/>
+                <w:szCs w:val="28"/>
+                <w:rtl w:val="0"/>
+              </w:rPr>
+              <w:t xml:space="preserve">поведенческий</w:t>
+            </w:r>
+          </w:p>
+        </w:tc>
+        <w:tc>
+          <w:tcPr/>
+          <w:p>
+            <w:pPr>
+              <w:rPr>
+                <w:sz w:val="28"/>
+                <w:szCs w:val="28"/>
+              </w:rPr>
+            </w:pPr>
+            <w:r>
+              <w:rPr>
+                <w:sz w:val="28"/>
+                <w:szCs w:val="28"/>
+                <w:rtl w:val="0"/>
+              </w:rPr>
+              <w:t xml:space="preserve">Фильтрация URL: цепочка правил (allow/deny) по заданной политике до окончательного решения «пускать / 403» (UR-2, FR-3).</w:t>
+            </w:r>
+          </w:p>
+        </w:tc>
+      </w:tr>
+      <w:tr>
+        <w:trPr>
+          <w:cantSplit w:val="0"/>
+          <w:tblHeader w:val="0"/>
+        </w:trPr>
+        <w:tc>
+          <w:tcPr/>
+          <w:p>
+            <w:pPr>
+              <w:rPr>
+                <w:sz w:val="28"/>
+                <w:szCs w:val="28"/>
+              </w:rPr>
+            </w:pPr>
+            <w:r>
+              <w:rPr>
+                <w:sz w:val="28"/>
+                <w:szCs w:val="28"/>
+                <w:rtl w:val="0"/>
+              </w:rPr>
+              <w:t xml:space="preserve">Strategy</w:t>
+            </w:r>
+          </w:p>
+        </w:tc>
+        <w:tc>
+          <w:tcPr/>
+          <w:p>
+            <w:pPr>
+              <w:rPr>
+                <w:sz w:val="28"/>
+                <w:szCs w:val="28"/>
+              </w:rPr>
+            </w:pPr>
+            <w:r>
+              <w:rPr>
+                <w:sz w:val="28"/>
+                <w:szCs w:val="28"/>
+                <w:rtl w:val="0"/>
+              </w:rPr>
+              <w:t xml:space="preserve">поведенческий</w:t>
+            </w:r>
+          </w:p>
+        </w:tc>
+        <w:tc>
+          <w:tcPr/>
+          <w:p>
+            <w:pPr>
+              <w:rPr>
+                <w:sz w:val="28"/>
+                <w:szCs w:val="28"/>
+              </w:rPr>
+            </w:pPr>
+            <w:r>
+              <w:rPr>
+                <w:sz w:val="28"/>
+                <w:szCs w:val="28"/>
+                <w:rtl w:val="0"/>
+              </w:rPr>
+              <w:t xml:space="preserve">Политика вытеснения в кеше (по договорённости LRU, см. раздел 3) оформляется через общий интерфейс и реализацию, внедрённую в ResponseCache (FR-8).</w:t>
+            </w:r>
+          </w:p>
+        </w:tc>
+      </w:tr>
+      <w:tr>
+        <w:trPr>
+          <w:cantSplit w:val="0"/>
+          <w:tblHeader w:val="0"/>
+        </w:trPr>
+        <w:tc>
+          <w:tcPr/>
+          <w:p>
+            <w:pPr>
+              <w:rPr>
+                <w:sz w:val="28"/>
+                <w:szCs w:val="28"/>
+              </w:rPr>
+            </w:pPr>
+            <w:r>
+              <w:rPr>
+                <w:sz w:val="28"/>
+                <w:szCs w:val="28"/>
+                <w:rtl w:val="0"/>
+              </w:rPr>
+              <w:t xml:space="preserve">Template Method (упрощённо)</w:t>
+            </w:r>
+          </w:p>
+        </w:tc>
+        <w:tc>
+          <w:tcPr/>
+          <w:p>
+            <w:pPr>
+              <w:rPr>
+                <w:sz w:val="28"/>
+                <w:szCs w:val="28"/>
+              </w:rPr>
+            </w:pPr>
+            <w:r>
+              <w:rPr>
+                <w:sz w:val="28"/>
+                <w:szCs w:val="28"/>
+                <w:rtl w:val="0"/>
+              </w:rPr>
+              <w:t xml:space="preserve">поведенческий</w:t>
+            </w:r>
+          </w:p>
+        </w:tc>
+        <w:tc>
+          <w:tcPr/>
+          <w:p>
+            <w:pPr>
+              <w:rPr>
+                <w:sz w:val="28"/>
+                <w:szCs w:val="28"/>
+              </w:rPr>
+            </w:pPr>
+            <w:r>
+              <w:rPr>
+                <w:rFonts w:ascii="Gungsuh" w:cs="Gungsuh" w:eastAsia="Gungsuh" w:hAnsi="Gungsuh"/>
+                <w:sz w:val="28"/>
+                <w:szCs w:val="28"/>
+                <w:rtl w:val="0"/>
+              </w:rPr>
+              <w:t xml:space="preserve">Общий сценарий «разобрать запрос → фильтр → кеш / upstream → ответ → лог» в HttpClientSession сокращает дублирование ветвлений FR-4, FR-5, FR-6.</w:t>
+            </w:r>
+          </w:p>
+        </w:tc>
+      </w:tr>
+    </w:tbl>
+    <w:p>
+      <w:pPr>
+        <w:rPr>
+          <w:sz w:val="28"/>
+          <w:szCs w:val="28"/>
+        </w:rPr>
+      </w:pPr>
+      <w:r>
+        <w:rPr>
+          <w:rtl w:val="0"/>
+        </w:rPr>
+      </w:r>
+    </w:p>
+    <w:p>
+      <w:pPr>
+        <w:ind w:firstLine="720"/>
+        <w:jc w:val="both"/>
+        <w:rPr>
+          <w:b w:val="1"/>
+          <w:bCs w:val="1"/>
+          <w:sz w:val="32"/>
+          <w:szCs w:val="32"/>
+        </w:rPr>
+      </w:pPr>
+      <w:r>
+        <w:rPr>
+          <w:b w:val="1"/>
+          <w:bCs w:val="1"/>
+          <w:sz w:val="32"/>
+          <w:szCs w:val="32"/>
+          <w:rtl w:val="0"/>
+        </w:rPr>
+        <w:t xml:space="preserve">8.2. Использование паттернов на уровне классов (примеры)</w:t>
+      </w:r>
+    </w:p>
+    <w:p>
+      <w:pPr>
+        <w:ind w:firstLine="720"/>
+        <w:jc w:val="both"/>
+        <w:rPr>
+          <w:sz w:val="28"/>
+          <w:szCs w:val="28"/>
+        </w:rPr>
+      </w:pPr>
+      <w:r>
+        <w:rPr>
+          <w:b w:val="1"/>
+          <w:bCs w:val="1"/>
+          <w:sz w:val="28"/>
+          <w:szCs w:val="28"/>
+          <w:rtl w:val="0"/>
+        </w:rPr>
+        <w:t xml:space="preserve">Proxy.</w:t>
+      </w:r>
+      <w:r>
+        <w:rPr>
+          <w:sz w:val="28"/>
+          <w:szCs w:val="28"/>
+          <w:rtl w:val="0"/>
+        </w:rPr>
+        <w:t xml:space="preserve"> Роль заместителя между клиентом и origin выполняет связка прослушивания сокета и сессии обработки: внешне для браузера — обычный HTTP, внутри — решение: отдать кеш, вернуть 403 или пойти в UpstreamConnector.</w:t>
+      </w:r>
+    </w:p>
+    <w:p>
+      <w:pPr>
+        <w:ind w:firstLine="720"/>
+        <w:jc w:val="both"/>
+        <w:rPr>
+          <w:sz w:val="28"/>
+          <w:szCs w:val="28"/>
+        </w:rPr>
+      </w:pPr>
+      <w:r>
+        <w:rPr>
+          <w:b w:val="1"/>
+          <w:bCs w:val="1"/>
+          <w:sz w:val="28"/>
+          <w:szCs w:val="28"/>
+          <w:rtl w:val="0"/>
+        </w:rPr>
+        <w:t xml:space="preserve">Фасад.</w:t>
+      </w:r>
+      <w:r>
+        <w:rPr>
+          <w:sz w:val="28"/>
+          <w:szCs w:val="28"/>
+          <w:rtl w:val="0"/>
+        </w:rPr>
+        <w:t xml:space="preserve"> Класс HttpProxyServer — точка accept и делегирования: UrlFilter, ResponseCache, EventLog, ClientSessionFactory без дублирования оркестрации в каждом сценарии.</w:t>
+      </w:r>
+    </w:p>
+    <w:p>
+      <w:pPr>
+        <w:ind w:firstLine="720"/>
+        <w:jc w:val="both"/>
+        <w:rPr>
+          <w:sz w:val="28"/>
+          <w:szCs w:val="28"/>
+        </w:rPr>
+      </w:pPr>
+      <w:r>
+        <w:rPr>
+          <w:b w:val="1"/>
+          <w:bCs w:val="1"/>
+          <w:sz w:val="28"/>
+          <w:szCs w:val="28"/>
+          <w:rtl w:val="0"/>
+        </w:rPr>
+        <w:t xml:space="preserve">Factory</w:t>
+      </w:r>
+      <w:r>
+        <w:rPr>
+          <w:sz w:val="28"/>
+          <w:szCs w:val="28"/>
+          <w:rtl w:val="0"/>
+        </w:rPr>
+        <w:t xml:space="preserve">. Класс ClientSessionFactory по клиентскому сокету формирует и запускает HttpClientSession с внедрёнными ссылками на общий фильтр, кеш и лог (порождающая инкапсуляция). </w:t>
+      </w:r>
+    </w:p>
+    <w:p>
+      <w:pPr>
+        <w:ind w:firstLine="720"/>
+        <w:jc w:val="both"/>
+        <w:rPr>
+          <w:sz w:val="28"/>
+          <w:szCs w:val="28"/>
+        </w:rPr>
+      </w:pPr>
+      <w:r>
+        <w:rPr>
+          <w:b w:val="1"/>
+          <w:bCs w:val="1"/>
+          <w:sz w:val="28"/>
+          <w:szCs w:val="28"/>
+          <w:rtl w:val="0"/>
+        </w:rPr>
+        <w:t xml:space="preserve">Singleton</w:t>
+      </w:r>
+      <w:r>
+        <w:rPr>
+          <w:b w:val="1"/>
+          <w:bCs w:val="1"/>
+          <w:sz w:val="28"/>
+          <w:szCs w:val="28"/>
+          <w:rtl w:val="0"/>
+        </w:rPr>
+        <w:t xml:space="preserve">.</w:t>
+      </w:r>
+      <w:r>
+        <w:rPr>
+          <w:sz w:val="28"/>
+          <w:szCs w:val="28"/>
+          <w:rtl w:val="0"/>
+        </w:rPr>
+        <w:t xml:space="preserve"> ProxyConfig (или эквивалент с явной load(path) и единым доступом на процесс) согласует read-only для воркеров после инициализации.</w:t>
+      </w:r>
+    </w:p>
+    <w:p>
+      <w:pPr>
+        <w:ind w:firstLine="720"/>
+        <w:jc w:val="both"/>
+        <w:rPr>
+          <w:sz w:val="28"/>
+          <w:szCs w:val="28"/>
+        </w:rPr>
+      </w:pPr>
+      <w:r>
+        <w:rPr>
+          <w:sz w:val="28"/>
+          <w:szCs w:val="28"/>
+          <w:rtl w:val="0"/>
+        </w:rPr>
+        <w:t xml:space="preserve">Chain of Responsibility. UrlFilter применяет сначала запрещающие шаблоны, при необходимости — разрешающий allow-лист, если он задан, и выносит окончательный вердикт.</w:t>
+      </w:r>
+    </w:p>
+    <w:p>
+      <w:pPr>
+        <w:ind w:firstLine="720"/>
+        <w:jc w:val="both"/>
+        <w:rPr>
+          <w:sz w:val="28"/>
+          <w:szCs w:val="28"/>
+        </w:rPr>
+      </w:pPr>
+      <w:r>
+        <w:rPr>
+          <w:b w:val="1"/>
+          <w:bCs w:val="1"/>
+          <w:sz w:val="28"/>
+          <w:szCs w:val="28"/>
+          <w:rtl w:val="0"/>
+        </w:rPr>
+        <w:t xml:space="preserve">Strategy.</w:t>
+      </w:r>
+      <w:r>
+        <w:rPr>
+          <w:sz w:val="28"/>
+          <w:szCs w:val="28"/>
+          <w:rtl w:val="0"/>
+        </w:rPr>
+        <w:t xml:space="preserve"> ICacheEvictionPolicy и реализация LruEvictionPolicy подключаются в ResponseCache; смена политики в config не требует переписывать весь механизм хранения тела ответа.</w:t>
+      </w:r>
+    </w:p>
+    <w:p>
+      <w:pPr>
+        <w:ind w:firstLine="720"/>
+        <w:jc w:val="both"/>
+        <w:rPr>
+          <w:sz w:val="28"/>
+          <w:szCs w:val="28"/>
+        </w:rPr>
+      </w:pPr>
+      <w:r>
+        <w:rPr>
+          <w:b w:val="1"/>
+          <w:bCs w:val="1"/>
+          <w:sz w:val="28"/>
+          <w:szCs w:val="28"/>
+          <w:rtl w:val="0"/>
+        </w:rPr>
+        <w:t xml:space="preserve">Template Method.</w:t>
+      </w:r>
+      <w:r>
+        <w:rPr>
+          <w:sz w:val="28"/>
+          <w:szCs w:val="28"/>
+          <w:rtl w:val="0"/>
+        </w:rPr>
+        <w:t xml:space="preserve"> В HttpClientSession общий run/process_parsed: разбор, проверка метода, фильтр, HIT/MISS, вызов fetch, формирование ответа и, для GET, условная запись в кеш (по заголовкам no-store / размеру).</w:t>
+      </w:r>
+    </w:p>
+    <w:p>
+      <w:pPr>
+        <w:ind w:firstLine="720"/>
+        <w:jc w:val="both"/>
+        <w:rPr>
+          <w:sz w:val="28"/>
+          <w:szCs w:val="28"/>
+        </w:rPr>
+      </w:pPr>
+      <w:r>
+        <w:rPr>
+          <w:sz w:val="28"/>
+          <w:szCs w:val="28"/>
+          <w:rtl w:val="0"/>
+        </w:rPr>
+        <w:t xml:space="preserve">Альтернативы (Observer, Object Pool) могут быть вынесены в направления развития при нагрузочном тестировании; для курсовой реализации достаточно перечисленного выше сопоставления с кодом (src/include, репозиторий проекта). </w:t>
+      </w:r>
+    </w:p>
+    <w:p>
+      <w:pPr>
+        <w:ind w:firstLine="720"/>
+        <w:jc w:val="both"/>
+        <w:rPr>
+          <w:sz w:val="28"/>
+          <w:szCs w:val="28"/>
+        </w:rPr>
+      </w:pPr>
+      <w:r>
+        <w:rPr>
+          <w:rtl w:val="0"/>
+        </w:rPr>
+      </w:r>
+    </w:p>
+    <w:p>
+      <w:pPr>
+        <w:ind w:left="0" w:firstLine="0"/>
+        <w:jc w:val="both"/>
+        <w:rPr>
+          <w:b w:val="1"/>
+          <w:bCs w:val="1"/>
+          <w:sz w:val="36"/>
+          <w:szCs w:val="36"/>
+        </w:rPr>
+      </w:pPr>
+      <w:r>
+        <w:rPr>
+          <w:b w:val="1"/>
+          <w:bCs w:val="1"/>
+          <w:sz w:val="36"/>
+          <w:szCs w:val="36"/>
+          <w:rtl w:val="0"/>
+        </w:rPr>
+        <w:t xml:space="preserve">9. Система сборки и структура исходного кода</w:t>
+      </w:r>
+    </w:p>
+    <w:p>
+      <w:pPr>
+        <w:ind w:firstLine="720"/>
+        <w:jc w:val="both"/>
+        <w:rPr>
+          <w:b w:val="1"/>
+          <w:bCs w:val="1"/>
+          <w:sz w:val="28"/>
+          <w:szCs w:val="28"/>
+        </w:rPr>
+      </w:pPr>
+      <w:r>
+        <w:rPr>
+          <w:b w:val="1"/>
+          <w:bCs w:val="1"/>
+          <w:sz w:val="28"/>
+          <w:szCs w:val="28"/>
+          <w:rtl w:val="0"/>
+        </w:rPr>
+        <w:t xml:space="preserve">9.1. Цель.</w:t>
+      </w:r>
+    </w:p>
+    <w:p>
+      <w:pPr>
+        <w:ind w:firstLine="720"/>
+        <w:jc w:val="both"/>
+        <w:rPr>
+          <w:sz w:val="28"/>
+          <w:szCs w:val="28"/>
+        </w:rPr>
+      </w:pPr>
+      <w:r>
+        <w:rPr>
+          <w:sz w:val="28"/>
+          <w:szCs w:val="28"/>
+          <w:rtl w:val="0"/>
+        </w:rPr>
+        <w:t xml:space="preserve">Организовать проект в виде промышленной структуры: модули (.h/.cpp), автоматическая сборка CMake, out-of-source build, сопровождение по README, подключение системной библиотеки потоков.</w:t>
+      </w:r>
+    </w:p>
+    <w:p>
+      <w:pPr>
+        <w:ind w:firstLine="720"/>
+        <w:jc w:val="both"/>
+        <w:rPr>
+          <w:b w:val="1"/>
+          <w:bCs w:val="1"/>
+          <w:sz w:val="28"/>
+          <w:szCs w:val="28"/>
+        </w:rPr>
+      </w:pPr>
+      <w:r>
+        <w:rPr>
+          <w:b w:val="1"/>
+          <w:bCs w:val="1"/>
+          <w:sz w:val="28"/>
+          <w:szCs w:val="28"/>
+          <w:rtl w:val="0"/>
+        </w:rPr>
+        <w:t xml:space="preserve">9.2. Файловая структура. </w:t>
+      </w:r>
+    </w:p>
+    <w:p>
+      <w:pPr>
+        <w:ind w:firstLine="720"/>
+        <w:jc w:val="both"/>
+        <w:rPr>
+          <w:sz w:val="28"/>
+          <w:szCs w:val="28"/>
+        </w:rPr>
+      </w:pPr>
+      <w:r>
+        <w:rPr>
+          <w:sz w:val="28"/>
+          <w:szCs w:val="28"/>
+          <w:rtl w:val="0"/>
+        </w:rPr>
+        <w:t xml:space="preserve">В репозитории: каталог include/ (публичные заголовки: proxy_config, url_filter, response_cache, event_log, upstream_connector, http_client_session, client_session_factory, http_proxy_server, ieviction_policy), каталог src/ (реализация + main.cpp), config/default_config.ini, корневой CMakeLists.txt, README.md с кратким описанием и шагами сборки.</w:t>
+      </w:r>
+    </w:p>
+    <w:p>
+      <w:pPr>
+        <w:ind w:firstLine="720"/>
+        <w:jc w:val="both"/>
+        <w:rPr>
+          <w:b w:val="1"/>
+          <w:bCs w:val="1"/>
+          <w:sz w:val="28"/>
+          <w:szCs w:val="28"/>
+        </w:rPr>
+      </w:pPr>
+      <w:r>
+        <w:rPr>
+          <w:b w:val="1"/>
+          <w:bCs w:val="1"/>
+          <w:sz w:val="28"/>
+          <w:szCs w:val="28"/>
+          <w:rtl w:val="0"/>
+        </w:rPr>
+        <w:t xml:space="preserve">9.3. Параметры.</w:t>
+      </w:r>
+    </w:p>
+    <w:p>
+      <w:pPr>
+        <w:ind w:firstLine="720"/>
+        <w:jc w:val="both"/>
+        <w:rPr>
+          <w:sz w:val="28"/>
+          <w:szCs w:val="28"/>
+        </w:rPr>
+      </w:pPr>
+      <w:r>
+        <w:rPr>
+          <w:sz w:val="28"/>
+          <w:szCs w:val="28"/>
+          <w:rtl w:val="0"/>
+        </w:rPr>
+        <w:t xml:space="preserve">Проекту задано имя, язык C++17, исполняемый файл add_executable (имя target_exec, как в задании), перечислены все .cpp, подключён include/ через target_include_directories, для std::thread — target_link_libraries(… Threads::Threads), сборка из отдельной папки build/.</w:t>
+      </w:r>
+    </w:p>
+    <w:p>
+      <w:pPr>
+        <w:ind w:firstLine="720"/>
+        <w:jc w:val="both"/>
+        <w:rPr>
+          <w:b w:val="1"/>
+          <w:bCs w:val="1"/>
+          <w:sz w:val="28"/>
+          <w:szCs w:val="28"/>
+        </w:rPr>
+      </w:pPr>
+      <w:r>
+        <w:rPr>
+          <w:b w:val="1"/>
+          <w:bCs w:val="1"/>
+          <w:sz w:val="28"/>
+          <w:szCs w:val="28"/>
+          <w:rtl w:val="0"/>
+        </w:rPr>
+        <w:t xml:space="preserve">9.4. Сборка и запуск.</w:t>
+      </w:r>
+    </w:p>
+    <w:p>
+      <w:pPr>
+        <w:ind w:firstLine="720"/>
+        <w:jc w:val="both"/>
+        <w:rPr>
+          <w:sz w:val="28"/>
+          <w:szCs w:val="28"/>
+        </w:rPr>
+      </w:pPr>
+      <w:r>
+        <w:rPr>
+          <w:sz w:val="28"/>
+          <w:szCs w:val="28"/>
+          <w:rtl w:val="0"/>
+        </w:rPr>
+        <w:t xml:space="preserve">Рекомендуемая последовательность: cmake -S . -B build; cmake --build build; далее cd build и ./target_exec с путём к конфигу (например, ../config/default_config.ini). На macOS при отсутствии Apple libc++ в CLT целесообразно указать компилятор LLVM From Homebrew (см. README). </w:t>
+      </w:r>
+    </w:p>
+    <w:p>
+      <w:pPr>
+        <w:ind w:firstLine="720"/>
+        <w:jc w:val="both"/>
+        <w:rPr>
+          <w:b w:val="1"/>
+          <w:bCs w:val="1"/>
+          <w:sz w:val="28"/>
+          <w:szCs w:val="28"/>
+        </w:rPr>
+      </w:pPr>
+      <w:r>
+        <w:rPr>
+          <w:b w:val="1"/>
+          <w:bCs w:val="1"/>
+          <w:sz w:val="28"/>
+          <w:szCs w:val="28"/>
+          <w:rtl w:val="0"/>
+        </w:rPr>
+        <w:t xml:space="preserve">9.5. Сторонние библиотеки.</w:t>
+      </w:r>
+    </w:p>
+    <w:p>
+      <w:pPr>
+        <w:ind w:firstLine="720"/>
+        <w:jc w:val="both"/>
+        <w:rPr>
+          <w:sz w:val="28"/>
+          <w:szCs w:val="28"/>
+        </w:rPr>
+      </w:pPr>
+      <w:r>
+        <w:rPr>
+          <w:sz w:val="28"/>
+          <w:szCs w:val="28"/>
+          <w:rtl w:val="0"/>
+        </w:rPr>
+        <w:t xml:space="preserve">Внешние зависимости минимальны: стандартная библиотека C++17, POSIX-сокеты и getaddrinfo, плюс при необходимости системный pthread через CMake Threads (для std::thread на части платформ). </w:t>
       </w:r>
     </w:p>
     <w:sectPr>
@@ -6709,6 +7836,55 @@
         <w:right w:w="0.0" w:type="dxa"/>
       </w:tblCellMar>
     </w:tblPr>
+  </w:style>
+  <w:style w:type="table" w:styleId="Table12">
+    <w:basedOn w:val="TableNormal"/>
+    <w:tblPr>
+      <w:tblStyleRowBandSize w:val="1"/>
+      <w:tblStyleColBandSize w:val="1"/>
+      <w:tblCellMar>
+        <w:top w:w="0.0" w:type="dxa"/>
+        <w:left w:w="115.0" w:type="dxa"/>
+        <w:bottom w:w="0.0" w:type="dxa"/>
+        <w:right w:w="115.0" w:type="dxa"/>
+      </w:tblCellMar>
+    </w:tblPr>
+    <w:tblStylePr w:type="band1Horz">
+      <w:tcPr/>
+    </w:tblStylePr>
+    <w:tblStylePr w:type="band1Vert">
+      <w:tcPr/>
+    </w:tblStylePr>
+    <w:tblStylePr w:type="band2Horz">
+      <w:tcPr/>
+    </w:tblStylePr>
+    <w:tblStylePr w:type="band2Vert">
+      <w:tcPr/>
+    </w:tblStylePr>
+    <w:tblStylePr w:type="firstCol">
+      <w:tcPr/>
+    </w:tblStylePr>
+    <w:tblStylePr w:type="firstRow">
+      <w:tcPr/>
+    </w:tblStylePr>
+    <w:tblStylePr w:type="lastCol">
+      <w:tcPr/>
+    </w:tblStylePr>
+    <w:tblStylePr w:type="lastRow">
+      <w:tcPr/>
+    </w:tblStylePr>
+    <w:tblStylePr w:type="neCell">
+      <w:tcPr/>
+    </w:tblStylePr>
+    <w:tblStylePr w:type="nwCell">
+      <w:tcPr/>
+    </w:tblStylePr>
+    <w:tblStylePr w:type="seCell">
+      <w:tcPr/>
+    </w:tblStylePr>
+    <w:tblStylePr w:type="swCell">
+      <w:tcPr/>
+    </w:tblStylePr>
   </w:style>
 </w:styles>
 </file>

</xml_diff>